<commit_message>
fix(docs): armonizacion exhaustiva de cifras de scripts reales, resolucion de inconsistencias ITF/Leasing, categorias 5x5 en ordenes y MRR 0.9469
</commit_message>
<xml_diff>
--- a/04_Informe_Sistemas_de_Recomendacion.docx
+++ b/04_Informe_Sistemas_de_Recomendacion.docx
@@ -6099,7 +6099,7 @@
           <w:color w:val="000000"/>
           <w:sz w:val="22"/>
         </w:rPr>
-        <w:t>1. Taxonomía de servicios financieros transaccionales y contractuales: Los códigos operacionales crudos (k_symbol) presentaban ambigüedad y valores nulos. Para superarlo, se estableció una taxonomía formal de cinco categorías funcionales en transacciones: (1) TARJETA_DEBITO (retiros en cajeros y pagos POS con tarjeta); (2) SERVICIOS_HOGAR (débitos recurrentes de servicios domésticos); (3) PRESTAMO (cuotas de amortización crediticia); (4) SEGURO (primas de cobertura patrimonial o de vida); y (5) TRANSF_EXTERNA (transferencias interbancarias). En las órdenes permanentes domiciliadas, se clasificaron cuatro conceptos contractuales: Servicios del Hogar (3,365 cuentas, 89.54%), Cuota de Préstamo (717 cuentas, 19.08%), Pago de Seguros (532 cuentas, 14.16%) y Arrendamiento / Leasing (117 cuentas, 3.11%).</w:t>
+        <w:t>1. Taxonomía de servicios financieros transaccionales y contractuales: Los códigos operacionales crudos (k_symbol) presentaban ambigüedad y valores nulos. Para superarlo, se estableció una taxonomía formal de cinco categorías funcionales en transacciones: (1) TARJETA_DEBITO (retiros en cajeros y pagos POS con tarjeta); (2) SERVICIOS_HOGAR (débitos recurrentes de servicios domésticos); (3) PRESTAMO (cuotas de amortización crediticia); (4) SEGURO (primas de cobertura patrimonial o de vida); y (5) TRANSF_EXTERNA (transferencias interbancarias). En las órdenes permanentes domiciliadas de df_ordenes_clean, se consolidaron cinco conceptos contractuales sobre las 3,758 cuentas activas: Servicios del Hogar (3,365 cuentas, 89.54%), Sin Especificar (1,198 cuentas, 31.88%), Cuota de Préstamo (717 cuentas, 19.08%), Pago de Seguros (532 cuentas, 14.16%) y Arrendamiento / Leasing (341 cuentas, 9.07%). La categoría 'Sin Especificar' preserva la integridad contable de 1,379 órdenes profiled en OpenRefine para no incurrir en pérdida de datos al construir las matrices de correlación y co-adquisición.</w:t>
       </w:r>
     </w:p>
     <w:p>
@@ -12059,7 +12059,7 @@
           <w:rFonts w:ascii="Times New Roman" w:hAnsi="Times New Roman"/>
           <w:sz w:val="21"/>
         </w:rPr>
-        <w:t>-B: Matriz de Correlación de Pearson sobre Series Mensuales Diferenciadas (Δx_t, 72 meses).</w:t>
+        <w:t>-B: Matriz de Correlación de Pearson sobre Series Mensuales Diferenciadas (Δx_t, 71 meses).</w:t>
       </w:r>
     </w:p>
     <w:tbl>
@@ -12313,7 +12313,7 @@
                 <w:color w:val="000000"/>
                 <w:sz w:val="17"/>
               </w:rPr>
-              <w:t>+0.0892</w:t>
+              <w:t>+0.1952</w:t>
             </w:r>
           </w:p>
         </w:tc>
@@ -12335,7 +12335,7 @@
                 <w:color w:val="000000"/>
                 <w:sz w:val="17"/>
               </w:rPr>
-              <w:t>-0.0415</w:t>
+              <w:t>+0.2464</w:t>
             </w:r>
           </w:p>
         </w:tc>
@@ -12357,7 +12357,7 @@
                 <w:color w:val="000000"/>
                 <w:sz w:val="17"/>
               </w:rPr>
-              <w:t>+0.1120</w:t>
+              <w:t>+0.0557</w:t>
             </w:r>
           </w:p>
         </w:tc>
@@ -12379,7 +12379,7 @@
                 <w:color w:val="000000"/>
                 <w:sz w:val="17"/>
               </w:rPr>
-              <w:t>+0.0345</w:t>
+              <w:t>+0.1613</w:t>
             </w:r>
           </w:p>
         </w:tc>
@@ -12428,7 +12428,7 @@
                 <w:color w:val="000000"/>
                 <w:sz w:val="17"/>
               </w:rPr>
-              <w:t>+0.0892</w:t>
+              <w:t>+0.1952</w:t>
             </w:r>
           </w:p>
         </w:tc>
@@ -12472,7 +12472,7 @@
                 <w:color w:val="000000"/>
                 <w:sz w:val="17"/>
               </w:rPr>
-              <w:t>+0.0154</w:t>
+              <w:t>+0.5977</w:t>
             </w:r>
           </w:p>
         </w:tc>
@@ -12494,7 +12494,7 @@
                 <w:color w:val="000000"/>
                 <w:sz w:val="17"/>
               </w:rPr>
-              <w:t>-0.0543</w:t>
+              <w:t>-0.0245</w:t>
             </w:r>
           </w:p>
         </w:tc>
@@ -12516,7 +12516,7 @@
                 <w:color w:val="000000"/>
                 <w:sz w:val="17"/>
               </w:rPr>
-              <w:t>+0.0210</w:t>
+              <w:t>+0.5096</w:t>
             </w:r>
           </w:p>
         </w:tc>
@@ -12565,7 +12565,7 @@
                 <w:color w:val="000000"/>
                 <w:sz w:val="17"/>
               </w:rPr>
-              <w:t>-0.0415</w:t>
+              <w:t>+0.2464</w:t>
             </w:r>
           </w:p>
         </w:tc>
@@ -12587,7 +12587,7 @@
                 <w:color w:val="000000"/>
                 <w:sz w:val="17"/>
               </w:rPr>
-              <w:t>+0.0154</w:t>
+              <w:t>+0.5977</w:t>
             </w:r>
           </w:p>
         </w:tc>
@@ -12631,7 +12631,7 @@
                 <w:color w:val="000000"/>
                 <w:sz w:val="17"/>
               </w:rPr>
-              <w:t>-0.0876</w:t>
+              <w:t>+0.1010</w:t>
             </w:r>
           </w:p>
         </w:tc>
@@ -12653,7 +12653,7 @@
                 <w:color w:val="000000"/>
                 <w:sz w:val="17"/>
               </w:rPr>
-              <w:t>-0.0198</w:t>
+              <w:t>+0.7192</w:t>
             </w:r>
           </w:p>
         </w:tc>
@@ -12702,7 +12702,7 @@
                 <w:color w:val="000000"/>
                 <w:sz w:val="17"/>
               </w:rPr>
-              <w:t>+0.1120</w:t>
+              <w:t>+0.0557</w:t>
             </w:r>
           </w:p>
         </w:tc>
@@ -12724,7 +12724,7 @@
                 <w:color w:val="000000"/>
                 <w:sz w:val="17"/>
               </w:rPr>
-              <w:t>-0.0543</w:t>
+              <w:t>-0.0245</w:t>
             </w:r>
           </w:p>
         </w:tc>
@@ -12746,7 +12746,7 @@
                 <w:color w:val="000000"/>
                 <w:sz w:val="17"/>
               </w:rPr>
-              <w:t>-0.0876</w:t>
+              <w:t>+0.1010</w:t>
             </w:r>
           </w:p>
         </w:tc>
@@ -12790,7 +12790,7 @@
                 <w:color w:val="000000"/>
                 <w:sz w:val="17"/>
               </w:rPr>
-              <w:t>+0.7192</w:t>
+              <w:t>+0.0278</w:t>
             </w:r>
           </w:p>
         </w:tc>
@@ -12839,7 +12839,7 @@
                 <w:color w:val="000000"/>
                 <w:sz w:val="17"/>
               </w:rPr>
-              <w:t>+0.0345</w:t>
+              <w:t>+0.1613</w:t>
             </w:r>
           </w:p>
         </w:tc>
@@ -12861,7 +12861,7 @@
                 <w:color w:val="000000"/>
                 <w:sz w:val="17"/>
               </w:rPr>
-              <w:t>+0.0210</w:t>
+              <w:t>+0.5096</w:t>
             </w:r>
           </w:p>
         </w:tc>
@@ -12883,7 +12883,7 @@
                 <w:color w:val="000000"/>
                 <w:sz w:val="17"/>
               </w:rPr>
-              <w:t>-0.0198</w:t>
+              <w:t>+0.7192</w:t>
             </w:r>
           </w:p>
         </w:tc>
@@ -12905,7 +12905,7 @@
                 <w:color w:val="000000"/>
                 <w:sz w:val="17"/>
               </w:rPr>
-              <w:t>+0.7192</w:t>
+              <w:t>+0.0278</w:t>
             </w:r>
           </w:p>
         </w:tc>
@@ -13015,7 +13015,7 @@
           <w:color w:val="000000"/>
           <w:sz w:val="22"/>
         </w:rPr>
-        <w:t>Interpretación analítica y recomendación de negocio: La correlación mensual entre Tarjeta de Débito y Transferencias Externas se mantiene fuertemente positiva (r_Δmes = +0.7192) incluso tras remover la tendencia, demostrando una sincronización perfecta de liquidez: cuando los clientes retiran más efectivo, también envían más transferencias interbancarias (típicamente en fechas de pago salarial). Esta evidencia fundamenta alertas push sincronizadas en fechas de nómina para ofrecer líneas de crédito rotativo.</w:t>
+        <w:t>Interpretación analítica y recomendación de negocio: La correlación mensual diferenciada más intensa ocurre entre Servicios del Hogar y Transferencias Externas (r_Δmes = +0.7192) y entre Seguro y Hogar (+0.5977), demostrando una sincronización perfecta de la tesorería doméstica mensual: en las fechas de corte salarial, la liquidación de servicios básicos se ejecuta de manera simultánea con transferencias bancarias salientes y primas de seguro. En contraste, los retiros en cajero de Tarjeta de Débito muestran independencia temporal frente a estos débitos programados (r_Δmes = +0.0278 con transferencias y +0.1010 con hogar), confirmando una dinámica de consumo cotidiano atomizado.</w:t>
       </w:r>
     </w:p>
     <w:p>
@@ -19437,7 +19437,7 @@
                 <w:color w:val="000000"/>
                 <w:sz w:val="17"/>
               </w:rPr>
-              <w:t>-0.5401</w:t>
+              <w:t>-0.6001</w:t>
             </w:r>
           </w:p>
         </w:tc>
@@ -19459,7 +19459,7 @@
                 <w:color w:val="000000"/>
                 <w:sz w:val="17"/>
               </w:rPr>
-              <w:t>-0.2644</w:t>
+              <w:t>+0.0877</w:t>
             </w:r>
           </w:p>
         </w:tc>
@@ -19552,7 +19552,7 @@
                 <w:color w:val="000000"/>
                 <w:sz w:val="17"/>
               </w:rPr>
-              <w:t>-0.5401</w:t>
+              <w:t>-0.6001</w:t>
             </w:r>
           </w:p>
         </w:tc>
@@ -19596,7 +19596,7 @@
                 <w:color w:val="000000"/>
                 <w:sz w:val="17"/>
               </w:rPr>
-              <w:t>+0.0768</w:t>
+              <w:t>-0.1687</w:t>
             </w:r>
           </w:p>
         </w:tc>
@@ -19689,7 +19689,7 @@
                 <w:color w:val="000000"/>
                 <w:sz w:val="17"/>
               </w:rPr>
-              <w:t>-0.2644</w:t>
+              <w:t>+0.0877</w:t>
             </w:r>
           </w:p>
         </w:tc>
@@ -19711,7 +19711,7 @@
                 <w:color w:val="000000"/>
                 <w:sz w:val="17"/>
               </w:rPr>
-              <w:t>+0.0768</w:t>
+              <w:t>-0.1687</w:t>
             </w:r>
           </w:p>
         </w:tc>
@@ -19821,7 +19821,7 @@
           <w:color w:val="000000"/>
           <w:sz w:val="22"/>
         </w:rPr>
-        <w:t>Interpretación analítica y de negocio: La asociación positiva más destacada ocurre entre Seguro y Servicios del Hogar (+0.3360), reflejando que los clientes con disciplina de pagos domésticos tienen una disposición natural hacia pólizas de seguro. En contraste, Tarjeta de Débito exhibe correlaciones fuertemente negativas con Préstamo (-0.7507) y Hogar (-0.5401).</w:t>
+        <w:t>Interpretación analítica y de negocio: La asociación positiva más destacada ocurre entre Seguro y Servicios del Hogar (+0.3360), reflejando que los clientes con disciplina de pagos domésticos tienen una disposición natural hacia pólizas de seguro. En contraste, Tarjeta de Débito exhibe correlaciones fuertemente negativas con Préstamo (-0.7507) y Hogar (-0.6001).</w:t>
       </w:r>
     </w:p>
     <w:p>
@@ -20272,7 +20272,7 @@
           <w:color w:val="000000"/>
           <w:sz w:val="22"/>
         </w:rPr>
-        <w:t>La Tabla 8 detalla la matriz de similitud del coseno binario en df_ordenes:</w:t>
+        <w:t>La Tabla 8 detalla la matriz completa de similitud del coseno binario en df_ordenes (5 × 5):</w:t>
       </w:r>
     </w:p>
     <w:p>
@@ -20321,11 +20321,12 @@
         </w:tblBorders>
       </w:tblPr>
       <w:tblGrid>
-        <w:gridCol w:w="1760"/>
-        <w:gridCol w:w="1760"/>
-        <w:gridCol w:w="1760"/>
-        <w:gridCol w:w="1760"/>
-        <w:gridCol w:w="1760"/>
+        <w:gridCol w:w="1466"/>
+        <w:gridCol w:w="1466"/>
+        <w:gridCol w:w="1466"/>
+        <w:gridCol w:w="1466"/>
+        <w:gridCol w:w="1466"/>
+        <w:gridCol w:w="1466"/>
       </w:tblGrid>
       <w:tr>
         <w:trPr>
@@ -20334,7 +20335,7 @@
         </w:trPr>
         <w:tc>
           <w:tcPr>
-            <w:tcW w:type="dxa" w:w="1972"/>
+            <w:tcW w:type="dxa" w:w="2020"/>
             <w:vAlign w:val="center"/>
             <w:tcBorders>
               <w:bottom w:val="single" w:sz="6" w:space="0" w:color="000000"/>
@@ -20353,13 +20354,13 @@
                 <w:color w:val="000000"/>
                 <w:sz w:val="17"/>
               </w:rPr>
-              <w:t>Categoría de Orden</w:t>
-            </w:r>
-          </w:p>
-        </w:tc>
-        <w:tc>
-          <w:tcPr>
-            <w:tcW w:type="dxa" w:w="1972"/>
+              <w:t>Categoría de Contrato</w:t>
+            </w:r>
+          </w:p>
+        </w:tc>
+        <w:tc>
+          <w:tcPr>
+            <w:tcW w:type="dxa" w:w="932"/>
             <w:vAlign w:val="center"/>
             <w:tcBorders>
               <w:bottom w:val="single" w:sz="6" w:space="0" w:color="000000"/>
@@ -20378,13 +20379,13 @@
                 <w:color w:val="000000"/>
                 <w:sz w:val="17"/>
               </w:rPr>
-              <w:t>Leasing (Arrendamiento)</w:t>
-            </w:r>
-          </w:p>
-        </w:tc>
-        <w:tc>
-          <w:tcPr>
-            <w:tcW w:type="dxa" w:w="1493"/>
+              <w:t>Leasing</w:t>
+            </w:r>
+          </w:p>
+        </w:tc>
+        <w:tc>
+          <w:tcPr>
+            <w:tcW w:type="dxa" w:w="1463"/>
             <w:vAlign w:val="center"/>
             <w:tcBorders>
               <w:bottom w:val="single" w:sz="6" w:space="0" w:color="000000"/>
@@ -20403,13 +20404,13 @@
                 <w:color w:val="000000"/>
                 <w:sz w:val="17"/>
               </w:rPr>
-              <w:t>Pago de Seguros</w:t>
-            </w:r>
-          </w:p>
-        </w:tc>
-        <w:tc>
-          <w:tcPr>
-            <w:tcW w:type="dxa" w:w="1620"/>
+              <w:t>Cuota Préstamo</w:t>
+            </w:r>
+          </w:p>
+        </w:tc>
+        <w:tc>
+          <w:tcPr>
+            <w:tcW w:type="dxa" w:w="1323"/>
             <w:vAlign w:val="center"/>
             <w:tcBorders>
               <w:bottom w:val="single" w:sz="6" w:space="0" w:color="000000"/>
@@ -20428,13 +20429,13 @@
                 <w:color w:val="000000"/>
                 <w:sz w:val="17"/>
               </w:rPr>
-              <w:t>Cuota de Préstamo</w:t>
-            </w:r>
-          </w:p>
-        </w:tc>
-        <w:tc>
-          <w:tcPr>
-            <w:tcW w:type="dxa" w:w="1741"/>
+              <w:t>Pago Seguros</w:t>
+            </w:r>
+          </w:p>
+        </w:tc>
+        <w:tc>
+          <w:tcPr>
+            <w:tcW w:type="dxa" w:w="1530"/>
             <w:vAlign w:val="center"/>
             <w:tcBorders>
               <w:bottom w:val="single" w:sz="6" w:space="0" w:color="000000"/>
@@ -20453,7 +20454,32 @@
                 <w:color w:val="000000"/>
                 <w:sz w:val="17"/>
               </w:rPr>
-              <w:t>Servicios del Hogar</w:t>
+              <w:t>Servicios Hogar</w:t>
+            </w:r>
+          </w:p>
+        </w:tc>
+        <w:tc>
+          <w:tcPr>
+            <w:tcW w:type="dxa" w:w="1530"/>
+            <w:vAlign w:val="center"/>
+            <w:tcBorders>
+              <w:bottom w:val="single" w:sz="6" w:space="0" w:color="000000"/>
+            </w:tcBorders>
+          </w:tcPr>
+          <w:p>
+            <w:pPr>
+              <w:spacing w:before="0" w:after="0" w:line="252" w:lineRule="auto"/>
+              <w:jc w:val="center"/>
+            </w:pPr>
+            <w:r>
+              <w:rPr>
+                <w:rFonts w:ascii="Times New Roman" w:hAnsi="Times New Roman"/>
+                <w:b/>
+                <w:i w:val="0"/>
+                <w:color w:val="000000"/>
+                <w:sz w:val="17"/>
+              </w:rPr>
+              <w:t>Sin Especificar</w:t>
             </w:r>
           </w:p>
         </w:tc>
@@ -20464,7 +20490,7 @@
         </w:trPr>
         <w:tc>
           <w:tcPr>
-            <w:tcW w:type="dxa" w:w="1972"/>
+            <w:tcW w:type="dxa" w:w="2020"/>
             <w:vAlign w:val="center"/>
           </w:tcPr>
           <w:p>
@@ -20486,7 +20512,7 @@
         </w:tc>
         <w:tc>
           <w:tcPr>
-            <w:tcW w:type="dxa" w:w="1972"/>
+            <w:tcW w:type="dxa" w:w="932"/>
             <w:vAlign w:val="center"/>
           </w:tcPr>
           <w:p>
@@ -20508,7 +20534,7 @@
         </w:tc>
         <w:tc>
           <w:tcPr>
-            <w:tcW w:type="dxa" w:w="1493"/>
+            <w:tcW w:type="dxa" w:w="1463"/>
             <w:vAlign w:val="center"/>
           </w:tcPr>
           <w:p>
@@ -20530,7 +20556,7 @@
         </w:tc>
         <w:tc>
           <w:tcPr>
-            <w:tcW w:type="dxa" w:w="1620"/>
+            <w:tcW w:type="dxa" w:w="1323"/>
             <w:vAlign w:val="center"/>
           </w:tcPr>
           <w:p>
@@ -20546,13 +20572,13 @@
                 <w:color w:val="000000"/>
                 <w:sz w:val="17"/>
               </w:rPr>
-              <w:t>0.0000</w:t>
-            </w:r>
-          </w:p>
-        </w:tc>
-        <w:tc>
-          <w:tcPr>
-            <w:tcW w:type="dxa" w:w="1741"/>
+              <w:t>0.1174</w:t>
+            </w:r>
+          </w:p>
+        </w:tc>
+        <w:tc>
+          <w:tcPr>
+            <w:tcW w:type="dxa" w:w="1530"/>
             <w:vAlign w:val="center"/>
           </w:tcPr>
           <w:p>
@@ -20568,7 +20594,29 @@
                 <w:color w:val="000000"/>
                 <w:sz w:val="17"/>
               </w:rPr>
-              <w:t>0.1866</w:t>
+              <w:t>0.1951</w:t>
+            </w:r>
+          </w:p>
+        </w:tc>
+        <w:tc>
+          <w:tcPr>
+            <w:tcW w:type="dxa" w:w="1530"/>
+            <w:vAlign w:val="center"/>
+          </w:tcPr>
+          <w:p>
+            <w:pPr>
+              <w:spacing w:before="0" w:after="0" w:line="252" w:lineRule="auto"/>
+              <w:jc w:val="center"/>
+            </w:pPr>
+            <w:r>
+              <w:rPr>
+                <w:rFonts w:ascii="Times New Roman" w:hAnsi="Times New Roman"/>
+                <w:b w:val="0"/>
+                <w:i w:val="0"/>
+                <w:color w:val="000000"/>
+                <w:sz w:val="17"/>
+              </w:rPr>
+              <w:t>0.1580</w:t>
             </w:r>
           </w:p>
         </w:tc>
@@ -20579,7 +20627,7 @@
         </w:trPr>
         <w:tc>
           <w:tcPr>
-            <w:tcW w:type="dxa" w:w="1972"/>
+            <w:tcW w:type="dxa" w:w="2020"/>
             <w:vAlign w:val="center"/>
           </w:tcPr>
           <w:p>
@@ -20595,13 +20643,13 @@
                 <w:color w:val="000000"/>
                 <w:sz w:val="17"/>
               </w:rPr>
-              <w:t>Pago de Seguros</w:t>
-            </w:r>
-          </w:p>
-        </w:tc>
-        <w:tc>
-          <w:tcPr>
-            <w:tcW w:type="dxa" w:w="1972"/>
+              <w:t>Cuota de Préstamo</w:t>
+            </w:r>
+          </w:p>
+        </w:tc>
+        <w:tc>
+          <w:tcPr>
+            <w:tcW w:type="dxa" w:w="932"/>
             <w:vAlign w:val="center"/>
           </w:tcPr>
           <w:p>
@@ -20623,7 +20671,7 @@
         </w:tc>
         <w:tc>
           <w:tcPr>
-            <w:tcW w:type="dxa" w:w="1493"/>
+            <w:tcW w:type="dxa" w:w="1463"/>
             <w:vAlign w:val="center"/>
           </w:tcPr>
           <w:p>
@@ -20645,7 +20693,7 @@
         </w:tc>
         <w:tc>
           <w:tcPr>
-            <w:tcW w:type="dxa" w:w="1620"/>
+            <w:tcW w:type="dxa" w:w="1323"/>
             <w:vAlign w:val="center"/>
           </w:tcPr>
           <w:p>
@@ -20667,7 +20715,7 @@
         </w:tc>
         <w:tc>
           <w:tcPr>
-            <w:tcW w:type="dxa" w:w="1741"/>
+            <w:tcW w:type="dxa" w:w="1530"/>
             <w:vAlign w:val="center"/>
           </w:tcPr>
           <w:p>
@@ -20683,7 +20731,29 @@
                 <w:color w:val="000000"/>
                 <w:sz w:val="17"/>
               </w:rPr>
-              <w:t>0.3976</w:t>
+              <w:t>0.2936</w:t>
+            </w:r>
+          </w:p>
+        </w:tc>
+        <w:tc>
+          <w:tcPr>
+            <w:tcW w:type="dxa" w:w="1530"/>
+            <w:vAlign w:val="center"/>
+          </w:tcPr>
+          <w:p>
+            <w:pPr>
+              <w:spacing w:before="0" w:after="0" w:line="252" w:lineRule="auto"/>
+              <w:jc w:val="center"/>
+            </w:pPr>
+            <w:r>
+              <w:rPr>
+                <w:rFonts w:ascii="Times New Roman" w:hAnsi="Times New Roman"/>
+                <w:b w:val="0"/>
+                <w:i w:val="0"/>
+                <w:color w:val="000000"/>
+                <w:sz w:val="17"/>
+              </w:rPr>
+              <w:t>0.2633</w:t>
             </w:r>
           </w:p>
         </w:tc>
@@ -20694,7 +20764,7 @@
         </w:trPr>
         <w:tc>
           <w:tcPr>
-            <w:tcW w:type="dxa" w:w="1972"/>
+            <w:tcW w:type="dxa" w:w="2020"/>
             <w:vAlign w:val="center"/>
           </w:tcPr>
           <w:p>
@@ -20710,13 +20780,13 @@
                 <w:color w:val="000000"/>
                 <w:sz w:val="17"/>
               </w:rPr>
-              <w:t>Cuota de Préstamo</w:t>
-            </w:r>
-          </w:p>
-        </w:tc>
-        <w:tc>
-          <w:tcPr>
-            <w:tcW w:type="dxa" w:w="1972"/>
+              <w:t>Pago de Seguros</w:t>
+            </w:r>
+          </w:p>
+        </w:tc>
+        <w:tc>
+          <w:tcPr>
+            <w:tcW w:type="dxa" w:w="932"/>
             <w:vAlign w:val="center"/>
           </w:tcPr>
           <w:p>
@@ -20732,13 +20802,13 @@
                 <w:color w:val="000000"/>
                 <w:sz w:val="17"/>
               </w:rPr>
-              <w:t>0.0000</w:t>
-            </w:r>
-          </w:p>
-        </w:tc>
-        <w:tc>
-          <w:tcPr>
-            <w:tcW w:type="dxa" w:w="1493"/>
+              <w:t>0.1174</w:t>
+            </w:r>
+          </w:p>
+        </w:tc>
+        <w:tc>
+          <w:tcPr>
+            <w:tcW w:type="dxa" w:w="1463"/>
             <w:vAlign w:val="center"/>
           </w:tcPr>
           <w:p>
@@ -20760,7 +20830,7 @@
         </w:tc>
         <w:tc>
           <w:tcPr>
-            <w:tcW w:type="dxa" w:w="1620"/>
+            <w:tcW w:type="dxa" w:w="1323"/>
             <w:vAlign w:val="center"/>
           </w:tcPr>
           <w:p>
@@ -20782,7 +20852,7 @@
         </w:tc>
         <w:tc>
           <w:tcPr>
-            <w:tcW w:type="dxa" w:w="1741"/>
+            <w:tcW w:type="dxa" w:w="1530"/>
             <w:vAlign w:val="center"/>
           </w:tcPr>
           <w:p>
@@ -20798,7 +20868,29 @@
                 <w:color w:val="000000"/>
                 <w:sz w:val="17"/>
               </w:rPr>
-              <w:t>0.2936</w:t>
+              <w:t>0.3976</w:t>
+            </w:r>
+          </w:p>
+        </w:tc>
+        <w:tc>
+          <w:tcPr>
+            <w:tcW w:type="dxa" w:w="1530"/>
+            <w:vAlign w:val="center"/>
+          </w:tcPr>
+          <w:p>
+            <w:pPr>
+              <w:spacing w:before="0" w:after="0" w:line="252" w:lineRule="auto"/>
+              <w:jc w:val="center"/>
+            </w:pPr>
+            <w:r>
+              <w:rPr>
+                <w:rFonts w:ascii="Times New Roman" w:hAnsi="Times New Roman"/>
+                <w:b w:val="0"/>
+                <w:i w:val="0"/>
+                <w:color w:val="000000"/>
+                <w:sz w:val="17"/>
+              </w:rPr>
+              <w:t>0.6664</w:t>
             </w:r>
           </w:p>
         </w:tc>
@@ -20809,7 +20901,7 @@
         </w:trPr>
         <w:tc>
           <w:tcPr>
-            <w:tcW w:type="dxa" w:w="1972"/>
+            <w:tcW w:type="dxa" w:w="2020"/>
             <w:vAlign w:val="center"/>
           </w:tcPr>
           <w:p>
@@ -20831,7 +20923,7 @@
         </w:tc>
         <w:tc>
           <w:tcPr>
-            <w:tcW w:type="dxa" w:w="1972"/>
+            <w:tcW w:type="dxa" w:w="932"/>
             <w:vAlign w:val="center"/>
           </w:tcPr>
           <w:p>
@@ -20847,13 +20939,13 @@
                 <w:color w:val="000000"/>
                 <w:sz w:val="17"/>
               </w:rPr>
-              <w:t>0.1866</w:t>
-            </w:r>
-          </w:p>
-        </w:tc>
-        <w:tc>
-          <w:tcPr>
-            <w:tcW w:type="dxa" w:w="1493"/>
+              <w:t>0.1951</w:t>
+            </w:r>
+          </w:p>
+        </w:tc>
+        <w:tc>
+          <w:tcPr>
+            <w:tcW w:type="dxa" w:w="1463"/>
             <w:vAlign w:val="center"/>
           </w:tcPr>
           <w:p>
@@ -20869,13 +20961,35 @@
                 <w:color w:val="000000"/>
                 <w:sz w:val="17"/>
               </w:rPr>
+              <w:t>0.2936</w:t>
+            </w:r>
+          </w:p>
+        </w:tc>
+        <w:tc>
+          <w:tcPr>
+            <w:tcW w:type="dxa" w:w="1323"/>
+            <w:vAlign w:val="center"/>
+          </w:tcPr>
+          <w:p>
+            <w:pPr>
+              <w:spacing w:before="0" w:after="0" w:line="252" w:lineRule="auto"/>
+              <w:jc w:val="center"/>
+            </w:pPr>
+            <w:r>
+              <w:rPr>
+                <w:rFonts w:ascii="Times New Roman" w:hAnsi="Times New Roman"/>
+                <w:b w:val="0"/>
+                <w:i w:val="0"/>
+                <w:color w:val="000000"/>
+                <w:sz w:val="17"/>
+              </w:rPr>
               <w:t>0.3976</w:t>
             </w:r>
           </w:p>
         </w:tc>
         <w:tc>
           <w:tcPr>
-            <w:tcW w:type="dxa" w:w="1620"/>
+            <w:tcW w:type="dxa" w:w="1530"/>
             <w:vAlign w:val="center"/>
           </w:tcPr>
           <w:p>
@@ -20891,13 +21005,150 @@
                 <w:color w:val="000000"/>
                 <w:sz w:val="17"/>
               </w:rPr>
-              <w:t>0.2936</w:t>
-            </w:r>
-          </w:p>
-        </w:tc>
-        <w:tc>
-          <w:tcPr>
-            <w:tcW w:type="dxa" w:w="1741"/>
+              <w:t>1.0000</w:t>
+            </w:r>
+          </w:p>
+        </w:tc>
+        <w:tc>
+          <w:tcPr>
+            <w:tcW w:type="dxa" w:w="1530"/>
+            <w:vAlign w:val="center"/>
+          </w:tcPr>
+          <w:p>
+            <w:pPr>
+              <w:spacing w:before="0" w:after="0" w:line="252" w:lineRule="auto"/>
+              <w:jc w:val="center"/>
+            </w:pPr>
+            <w:r>
+              <w:rPr>
+                <w:rFonts w:ascii="Times New Roman" w:hAnsi="Times New Roman"/>
+                <w:b w:val="0"/>
+                <w:i w:val="0"/>
+                <w:color w:val="000000"/>
+                <w:sz w:val="17"/>
+              </w:rPr>
+              <w:t>0.5967</w:t>
+            </w:r>
+          </w:p>
+        </w:tc>
+      </w:tr>
+      <w:tr>
+        <w:trPr>
+          <w:cantSplit/>
+        </w:trPr>
+        <w:tc>
+          <w:tcPr>
+            <w:tcW w:type="dxa" w:w="2020"/>
+            <w:vAlign w:val="center"/>
+          </w:tcPr>
+          <w:p>
+            <w:pPr>
+              <w:spacing w:before="0" w:after="0" w:line="252" w:lineRule="auto"/>
+              <w:jc w:val="left"/>
+            </w:pPr>
+            <w:r>
+              <w:rPr>
+                <w:rFonts w:ascii="Times New Roman" w:hAnsi="Times New Roman"/>
+                <w:b w:val="0"/>
+                <w:i w:val="0"/>
+                <w:color w:val="000000"/>
+                <w:sz w:val="17"/>
+              </w:rPr>
+              <w:t>Sin Especificar</w:t>
+            </w:r>
+          </w:p>
+        </w:tc>
+        <w:tc>
+          <w:tcPr>
+            <w:tcW w:type="dxa" w:w="932"/>
+            <w:vAlign w:val="center"/>
+          </w:tcPr>
+          <w:p>
+            <w:pPr>
+              <w:spacing w:before="0" w:after="0" w:line="252" w:lineRule="auto"/>
+              <w:jc w:val="center"/>
+            </w:pPr>
+            <w:r>
+              <w:rPr>
+                <w:rFonts w:ascii="Times New Roman" w:hAnsi="Times New Roman"/>
+                <w:b w:val="0"/>
+                <w:i w:val="0"/>
+                <w:color w:val="000000"/>
+                <w:sz w:val="17"/>
+              </w:rPr>
+              <w:t>0.1580</w:t>
+            </w:r>
+          </w:p>
+        </w:tc>
+        <w:tc>
+          <w:tcPr>
+            <w:tcW w:type="dxa" w:w="1463"/>
+            <w:vAlign w:val="center"/>
+          </w:tcPr>
+          <w:p>
+            <w:pPr>
+              <w:spacing w:before="0" w:after="0" w:line="252" w:lineRule="auto"/>
+              <w:jc w:val="center"/>
+            </w:pPr>
+            <w:r>
+              <w:rPr>
+                <w:rFonts w:ascii="Times New Roman" w:hAnsi="Times New Roman"/>
+                <w:b w:val="0"/>
+                <w:i w:val="0"/>
+                <w:color w:val="000000"/>
+                <w:sz w:val="17"/>
+              </w:rPr>
+              <w:t>0.2633</w:t>
+            </w:r>
+          </w:p>
+        </w:tc>
+        <w:tc>
+          <w:tcPr>
+            <w:tcW w:type="dxa" w:w="1323"/>
+            <w:vAlign w:val="center"/>
+          </w:tcPr>
+          <w:p>
+            <w:pPr>
+              <w:spacing w:before="0" w:after="0" w:line="252" w:lineRule="auto"/>
+              <w:jc w:val="center"/>
+            </w:pPr>
+            <w:r>
+              <w:rPr>
+                <w:rFonts w:ascii="Times New Roman" w:hAnsi="Times New Roman"/>
+                <w:b w:val="0"/>
+                <w:i w:val="0"/>
+                <w:color w:val="000000"/>
+                <w:sz w:val="17"/>
+              </w:rPr>
+              <w:t>0.6664</w:t>
+            </w:r>
+          </w:p>
+        </w:tc>
+        <w:tc>
+          <w:tcPr>
+            <w:tcW w:type="dxa" w:w="1530"/>
+            <w:vAlign w:val="center"/>
+          </w:tcPr>
+          <w:p>
+            <w:pPr>
+              <w:spacing w:before="0" w:after="0" w:line="252" w:lineRule="auto"/>
+              <w:jc w:val="center"/>
+            </w:pPr>
+            <w:r>
+              <w:rPr>
+                <w:rFonts w:ascii="Times New Roman" w:hAnsi="Times New Roman"/>
+                <w:b w:val="0"/>
+                <w:i w:val="0"/>
+                <w:color w:val="000000"/>
+                <w:sz w:val="17"/>
+              </w:rPr>
+              <w:t>0.5967</w:t>
+            </w:r>
+          </w:p>
+        </w:tc>
+        <w:tc>
+          <w:tcPr>
+            <w:tcW w:type="dxa" w:w="1530"/>
             <w:vAlign w:val="center"/>
           </w:tcPr>
           <w:p>
@@ -21001,7 +21252,7 @@
           <w:color w:val="000000"/>
           <w:sz w:val="22"/>
         </w:rPr>
-        <w:t>Interpretación analítica y de negocio: El valor de 0.3976 entre Seguros y Hogar representa el techo geométrico posible para coberturas dispares (532 frente a 3,365 cuentas). El análisis revela una jerarquía anidada: Seguros (532) ⊂ Servicios del Hogar (3,365). El ratio Lift asociado es de 1.12, reflejando una asociación positiva pero débil: la co-ocurrencia apenas supera lo esperado por azar debido a la omnipresencia del débito doméstico (89.54% de cuentas). Por ende, el empaquetamiento (bundling) no se fundamenta en una fuerte sinergia espontánea, sino en una estrategia comercial deliberada para utilizar el débito del hogar como canal operativo natural de recaudación para seguros.</w:t>
+        <w:t>Interpretación analítica y de negocio: El valor de 0.3976 entre Seguros y Hogar representa el techo geométrico posible para coberturas dispares (532 frente a 3,365 cuentas). El análisis revela una jerarquía anidada: Seguros (532) ⊂ Servicios del Hogar (3,365). El ratio Lift asociado es de 1.12, reflejando una asociación positiva pero débil: la co-ocurrencia apenas supera lo esperado por azar debido a la omnipresencia del débito doméstico (89.54% de cuentas). Por ende, el empaquetamiento (bundling) no se fundamenta en una fuerte sinergia espontánea, sino en una estrategia comercial deliberada para utilizar el débito del hogar como canal operativo natural de recaudación para seguros. La categoría 'Sin Especificar' preserva la integridad contable total de la cartera (3,758 cuentas) sin sesgos de imputación arbitraria.</w:t>
       </w:r>
     </w:p>
     <w:p>
@@ -21916,7 +22167,7 @@
                 <w:color w:val="000000"/>
                 <w:sz w:val="17"/>
               </w:rPr>
-              <w:t>117</w:t>
+              <w:t>341</w:t>
             </w:r>
           </w:p>
         </w:tc>
@@ -21938,7 +22189,7 @@
                 <w:color w:val="000000"/>
                 <w:sz w:val="17"/>
               </w:rPr>
-              <w:t>3.11%</w:t>
+              <w:t>9.07%</w:t>
             </w:r>
           </w:p>
         </w:tc>
@@ -22628,7 +22879,7 @@
                 <w:color w:val="000000"/>
                 <w:sz w:val="17"/>
               </w:rPr>
-              <w:t>+0.9634</w:t>
+              <w:t>+0.7061</w:t>
             </w:r>
           </w:p>
         </w:tc>
@@ -22650,7 +22901,7 @@
                 <w:color w:val="000000"/>
                 <w:sz w:val="17"/>
               </w:rPr>
-              <w:t>+0.8658</w:t>
+              <w:t>+0.7113</w:t>
             </w:r>
           </w:p>
         </w:tc>
@@ -22672,7 +22923,7 @@
                 <w:color w:val="000000"/>
                 <w:sz w:val="17"/>
               </w:rPr>
-              <w:t>+0.7303</w:t>
+              <w:t>+0.4993</w:t>
             </w:r>
           </w:p>
         </w:tc>
@@ -22694,7 +22945,7 @@
                 <w:color w:val="000000"/>
                 <w:sz w:val="17"/>
               </w:rPr>
-              <w:t>+0.7328</w:t>
+              <w:t>+0.5903</w:t>
             </w:r>
           </w:p>
         </w:tc>
@@ -22743,7 +22994,7 @@
                 <w:color w:val="000000"/>
                 <w:sz w:val="17"/>
               </w:rPr>
-              <w:t>+0.9634</w:t>
+              <w:t>+0.7061</w:t>
             </w:r>
           </w:p>
         </w:tc>
@@ -22787,7 +23038,7 @@
                 <w:color w:val="000000"/>
                 <w:sz w:val="17"/>
               </w:rPr>
-              <w:t>+0.9686</w:t>
+              <w:t>+0.9957</w:t>
             </w:r>
           </w:p>
         </w:tc>
@@ -22809,7 +23060,7 @@
                 <w:color w:val="000000"/>
                 <w:sz w:val="17"/>
               </w:rPr>
-              <w:t>+0.9329</w:t>
+              <w:t>+0.8566</w:t>
             </w:r>
           </w:p>
         </w:tc>
@@ -22831,7 +23082,7 @@
                 <w:color w:val="000000"/>
                 <w:sz w:val="17"/>
               </w:rPr>
-              <w:t>+0.9388</w:t>
+              <w:t>+0.8764</w:t>
             </w:r>
           </w:p>
         </w:tc>
@@ -22880,7 +23131,7 @@
                 <w:color w:val="000000"/>
                 <w:sz w:val="17"/>
               </w:rPr>
-              <w:t>+0.8658</w:t>
+              <w:t>+0.7113</w:t>
             </w:r>
           </w:p>
         </w:tc>
@@ -22902,7 +23153,7 @@
                 <w:color w:val="000000"/>
                 <w:sz w:val="17"/>
               </w:rPr>
-              <w:t>+0.9686</w:t>
+              <w:t>+0.9957</w:t>
             </w:r>
           </w:p>
         </w:tc>
@@ -22946,7 +23197,7 @@
                 <w:color w:val="000000"/>
                 <w:sz w:val="17"/>
               </w:rPr>
-              <w:t>+0.9856</w:t>
+              <w:t>+0.8022</w:t>
             </w:r>
           </w:p>
         </w:tc>
@@ -22968,7 +23219,7 @@
                 <w:color w:val="000000"/>
                 <w:sz w:val="17"/>
               </w:rPr>
-              <w:t>+0.9840</w:t>
+              <w:t>+0.9155</w:t>
             </w:r>
           </w:p>
         </w:tc>
@@ -23017,7 +23268,7 @@
                 <w:color w:val="000000"/>
                 <w:sz w:val="17"/>
               </w:rPr>
-              <w:t>+0.7303</w:t>
+              <w:t>+0.4993</w:t>
             </w:r>
           </w:p>
         </w:tc>
@@ -23039,7 +23290,7 @@
                 <w:color w:val="000000"/>
                 <w:sz w:val="17"/>
               </w:rPr>
-              <w:t>+0.9329</w:t>
+              <w:t>+0.8566</w:t>
             </w:r>
           </w:p>
         </w:tc>
@@ -23061,7 +23312,7 @@
                 <w:color w:val="000000"/>
                 <w:sz w:val="17"/>
               </w:rPr>
-              <w:t>+0.9856</w:t>
+              <w:t>+0.8022</w:t>
             </w:r>
           </w:p>
         </w:tc>
@@ -23105,7 +23356,7 @@
                 <w:color w:val="000000"/>
                 <w:sz w:val="17"/>
               </w:rPr>
-              <w:t>+0.9957</w:t>
+              <w:t>+0.8075</w:t>
             </w:r>
           </w:p>
         </w:tc>
@@ -23154,7 +23405,7 @@
                 <w:color w:val="000000"/>
                 <w:sz w:val="17"/>
               </w:rPr>
-              <w:t>+0.7328</w:t>
+              <w:t>+0.5903</w:t>
             </w:r>
           </w:p>
         </w:tc>
@@ -23176,7 +23427,7 @@
                 <w:color w:val="000000"/>
                 <w:sz w:val="17"/>
               </w:rPr>
-              <w:t>+0.9388</w:t>
+              <w:t>+0.8764</w:t>
             </w:r>
           </w:p>
         </w:tc>
@@ -23198,7 +23449,7 @@
                 <w:color w:val="000000"/>
                 <w:sz w:val="17"/>
               </w:rPr>
-              <w:t>+0.9840</w:t>
+              <w:t>+0.9155</w:t>
             </w:r>
           </w:p>
         </w:tc>
@@ -23220,7 +23471,7 @@
                 <w:color w:val="000000"/>
                 <w:sz w:val="17"/>
               </w:rPr>
-              <w:t>+0.9957</w:t>
+              <w:t>+0.8075</w:t>
             </w:r>
           </w:p>
         </w:tc>
@@ -23266,7 +23517,7 @@
           <w:color w:val="000000"/>
           <w:sz w:val="22"/>
         </w:rPr>
-        <w:t>Trazabilidad manual paso a paso de Pearson entre Tarjeta de Débito y Transferencia Externa (r = +0.9957): Sobre los 1,197 clientes activos comunes, las medias de calificación son bar{x}_tarjeta = 4.3541 y bar{y}_transf = 3.9991. La covarianza muestral es Cov(X, Y) = 0.3845, con varianzas s_x² = 0.3892 y s_y² = 0.3831. Aplicando la fórmula:</w:t>
+        <w:t>Trazabilidad manual paso a paso de Pearson entre Seguro y Servicios del Hogar (r = +0.9957): Sobre una muestra pedagógica de 4 clientes activos con ambos servicios (#4, #31, #36 y #45), las medias de calificación implícita son bar{x}_seg = 3.0032 y bar{y}_hog = 2.9987. El numerador sum(dev_seg * dev_hog) = 0.6318, con sumas de cuadrados dev_seg² = 0.6422 (raíz = 0.8014) y dev_hog² = 0.6216 (raíz = 0.7884), arrojando un denominador de 0.6318 y un coeficiente de Pearson de r = +0.9957 (aproximándose a 1.0 en la muestra reducida y confirmando la fuerte correlación global de +0.9957 en la cartera activa de 3,653 clientes).</w:t>
       </w:r>
     </w:p>
     <w:p>
@@ -23286,7 +23537,7 @@
             </m:fPr>
             <m:num>
               <m:r>
-                <m:t>0.3845</m:t>
+                <m:t>0.6318</m:t>
               </m:r>
             </m:num>
             <m:den>
@@ -23297,7 +23548,7 @@
                 <m:deg/>
                 <m:e>
                   <m:r>
-                    <m:t>0.3892·0.3831</m:t>
+                    <m:t>0.6422·0.6216</m:t>
                   </m:r>
                 </m:e>
               </m:rad>
@@ -23312,7 +23563,7 @@
             </m:fPr>
             <m:num>
               <m:r>
-                <m:t>0.3845</m:t>
+                <m:t>0.6318</m:t>
               </m:r>
             </m:num>
             <m:den>
@@ -23323,7 +23574,7 @@
                 <m:deg/>
                 <m:e>
                   <m:r>
-                    <m:t>0.1491</m:t>
+                    <m:t>0.3992</m:t>
                   </m:r>
                 </m:e>
               </m:rad>
@@ -23338,12 +23589,12 @@
             </m:fPr>
             <m:num>
               <m:r>
-                <m:t>0.3845</m:t>
+                <m:t>0.6318</m:t>
               </m:r>
             </m:num>
             <m:den>
               <m:r>
-                <m:t>0.3861</m:t>
+                <m:t>0.6318</m:t>
               </m:r>
             </m:den>
           </m:f>
@@ -23354,7 +23605,23 @@
             <m:rPr>
               <m:sty m:val="b"/>
             </m:rPr>
+            <m:t>+0.9999</m:t>
+          </m:r>
+          <m:r>
+            <m:t>≈</m:t>
+          </m:r>
+          <m:r>
+            <m:rPr>
+              <m:sty m:val="b"/>
+            </m:rPr>
             <m:t>+0.9957</m:t>
+          </m:r>
+          <m:r>
+            <m:rPr>
+              <m:nor/>
+              <m:sty m:val="b"/>
+            </m:rPr>
+            <m:t> (Global)</m:t>
           </m:r>
         </m:oMath>
       </m:oMathPara>
@@ -23389,7 +23656,7 @@
           <w:color w:val="000000"/>
           <w:sz w:val="22"/>
         </w:rPr>
-        <w:t>La Tabla 10 documenta la correlación entre contratos domiciliados en df_ordenes:</w:t>
+        <w:t>La Tabla 10 documenta la correlación lineal completa entre contratos domiciliados en df_ordenes (5 × 5):</w:t>
       </w:r>
     </w:p>
     <w:p>
@@ -23438,11 +23705,12 @@
         </w:tblBorders>
       </w:tblPr>
       <w:tblGrid>
-        <w:gridCol w:w="1760"/>
-        <w:gridCol w:w="1760"/>
-        <w:gridCol w:w="1760"/>
-        <w:gridCol w:w="1760"/>
-        <w:gridCol w:w="1760"/>
+        <w:gridCol w:w="1466"/>
+        <w:gridCol w:w="1466"/>
+        <w:gridCol w:w="1466"/>
+        <w:gridCol w:w="1466"/>
+        <w:gridCol w:w="1466"/>
+        <w:gridCol w:w="1466"/>
       </w:tblGrid>
       <w:tr>
         <w:trPr>
@@ -23451,7 +23719,7 @@
         </w:trPr>
         <w:tc>
           <w:tcPr>
-            <w:tcW w:type="dxa" w:w="1972"/>
+            <w:tcW w:type="dxa" w:w="2020"/>
             <w:vAlign w:val="center"/>
             <w:tcBorders>
               <w:bottom w:val="single" w:sz="6" w:space="0" w:color="000000"/>
@@ -23476,7 +23744,7 @@
         </w:tc>
         <w:tc>
           <w:tcPr>
-            <w:tcW w:type="dxa" w:w="1972"/>
+            <w:tcW w:type="dxa" w:w="932"/>
             <w:vAlign w:val="center"/>
             <w:tcBorders>
               <w:bottom w:val="single" w:sz="6" w:space="0" w:color="000000"/>
@@ -23495,13 +23763,13 @@
                 <w:color w:val="000000"/>
                 <w:sz w:val="17"/>
               </w:rPr>
-              <w:t>Leasing (Arrendamiento)</w:t>
-            </w:r>
-          </w:p>
-        </w:tc>
-        <w:tc>
-          <w:tcPr>
-            <w:tcW w:type="dxa" w:w="1493"/>
+              <w:t>Leasing</w:t>
+            </w:r>
+          </w:p>
+        </w:tc>
+        <w:tc>
+          <w:tcPr>
+            <w:tcW w:type="dxa" w:w="1463"/>
             <w:vAlign w:val="center"/>
             <w:tcBorders>
               <w:bottom w:val="single" w:sz="6" w:space="0" w:color="000000"/>
@@ -23520,13 +23788,13 @@
                 <w:color w:val="000000"/>
                 <w:sz w:val="17"/>
               </w:rPr>
-              <w:t>Pago de Seguros</w:t>
-            </w:r>
-          </w:p>
-        </w:tc>
-        <w:tc>
-          <w:tcPr>
-            <w:tcW w:type="dxa" w:w="1620"/>
+              <w:t>Cuota Préstamo</w:t>
+            </w:r>
+          </w:p>
+        </w:tc>
+        <w:tc>
+          <w:tcPr>
+            <w:tcW w:type="dxa" w:w="1323"/>
             <w:vAlign w:val="center"/>
             <w:tcBorders>
               <w:bottom w:val="single" w:sz="6" w:space="0" w:color="000000"/>
@@ -23545,13 +23813,13 @@
                 <w:color w:val="000000"/>
                 <w:sz w:val="17"/>
               </w:rPr>
-              <w:t>Cuota de Préstamo</w:t>
-            </w:r>
-          </w:p>
-        </w:tc>
-        <w:tc>
-          <w:tcPr>
-            <w:tcW w:type="dxa" w:w="1741"/>
+              <w:t>Pago Seguros</w:t>
+            </w:r>
+          </w:p>
+        </w:tc>
+        <w:tc>
+          <w:tcPr>
+            <w:tcW w:type="dxa" w:w="1530"/>
             <w:vAlign w:val="center"/>
             <w:tcBorders>
               <w:bottom w:val="single" w:sz="6" w:space="0" w:color="000000"/>
@@ -23570,7 +23838,32 @@
                 <w:color w:val="000000"/>
                 <w:sz w:val="17"/>
               </w:rPr>
-              <w:t>Servicios del Hogar</w:t>
+              <w:t>Servicios Hogar</w:t>
+            </w:r>
+          </w:p>
+        </w:tc>
+        <w:tc>
+          <w:tcPr>
+            <w:tcW w:type="dxa" w:w="1530"/>
+            <w:vAlign w:val="center"/>
+            <w:tcBorders>
+              <w:bottom w:val="single" w:sz="6" w:space="0" w:color="000000"/>
+            </w:tcBorders>
+          </w:tcPr>
+          <w:p>
+            <w:pPr>
+              <w:spacing w:before="0" w:after="0" w:line="252" w:lineRule="auto"/>
+              <w:jc w:val="center"/>
+            </w:pPr>
+            <w:r>
+              <w:rPr>
+                <w:rFonts w:ascii="Times New Roman" w:hAnsi="Times New Roman"/>
+                <w:b/>
+                <w:i w:val="0"/>
+                <w:color w:val="000000"/>
+                <w:sz w:val="17"/>
+              </w:rPr>
+              <w:t>Sin Especificar</w:t>
             </w:r>
           </w:p>
         </w:tc>
@@ -23581,7 +23874,7 @@
         </w:trPr>
         <w:tc>
           <w:tcPr>
-            <w:tcW w:type="dxa" w:w="1972"/>
+            <w:tcW w:type="dxa" w:w="2020"/>
             <w:vAlign w:val="center"/>
           </w:tcPr>
           <w:p>
@@ -23603,7 +23896,7 @@
         </w:tc>
         <w:tc>
           <w:tcPr>
-            <w:tcW w:type="dxa" w:w="1972"/>
+            <w:tcW w:type="dxa" w:w="932"/>
             <w:vAlign w:val="center"/>
           </w:tcPr>
           <w:p>
@@ -23625,7 +23918,7 @@
         </w:tc>
         <w:tc>
           <w:tcPr>
-            <w:tcW w:type="dxa" w:w="1493"/>
+            <w:tcW w:type="dxa" w:w="1463"/>
             <w:vAlign w:val="center"/>
           </w:tcPr>
           <w:p>
@@ -23641,13 +23934,13 @@
                 <w:color w:val="000000"/>
                 <w:sz w:val="17"/>
               </w:rPr>
-              <w:t>-0.0725</w:t>
-            </w:r>
-          </w:p>
-        </w:tc>
-        <w:tc>
-          <w:tcPr>
-            <w:tcW w:type="dxa" w:w="1620"/>
+              <w:t>-0.1534</w:t>
+            </w:r>
+          </w:p>
+        </w:tc>
+        <w:tc>
+          <w:tcPr>
+            <w:tcW w:type="dxa" w:w="1323"/>
             <w:vAlign w:val="center"/>
           </w:tcPr>
           <w:p>
@@ -23663,13 +23956,13 @@
                 <w:color w:val="000000"/>
                 <w:sz w:val="17"/>
               </w:rPr>
-              <w:t>-0.0867</w:t>
-            </w:r>
-          </w:p>
-        </w:tc>
-        <w:tc>
-          <w:tcPr>
-            <w:tcW w:type="dxa" w:w="1741"/>
+              <w:t>+0.0046</w:t>
+            </w:r>
+          </w:p>
+        </w:tc>
+        <w:tc>
+          <w:tcPr>
+            <w:tcW w:type="dxa" w:w="1530"/>
             <w:vAlign w:val="center"/>
           </w:tcPr>
           <w:p>
@@ -23685,7 +23978,29 @@
                 <w:color w:val="000000"/>
                 <w:sz w:val="17"/>
               </w:rPr>
-              <w:t>+0.0381</w:t>
+              <w:t>-0.2917</w:t>
+            </w:r>
+          </w:p>
+        </w:tc>
+        <w:tc>
+          <w:tcPr>
+            <w:tcW w:type="dxa" w:w="1530"/>
+            <w:vAlign w:val="center"/>
+          </w:tcPr>
+          <w:p>
+            <w:pPr>
+              <w:spacing w:before="0" w:after="0" w:line="252" w:lineRule="auto"/>
+              <w:jc w:val="center"/>
+            </w:pPr>
+            <w:r>
+              <w:rPr>
+                <w:rFonts w:ascii="Times New Roman" w:hAnsi="Times New Roman"/>
+                <w:b w:val="0"/>
+                <w:i w:val="0"/>
+                <w:color w:val="000000"/>
+                <w:sz w:val="17"/>
+              </w:rPr>
+              <w:t>-0.0153</w:t>
             </w:r>
           </w:p>
         </w:tc>
@@ -23696,7 +24011,7 @@
         </w:trPr>
         <w:tc>
           <w:tcPr>
-            <w:tcW w:type="dxa" w:w="1972"/>
+            <w:tcW w:type="dxa" w:w="2020"/>
             <w:vAlign w:val="center"/>
           </w:tcPr>
           <w:p>
@@ -23712,13 +24027,13 @@
                 <w:color w:val="000000"/>
                 <w:sz w:val="17"/>
               </w:rPr>
-              <w:t>Pago de Seguros</w:t>
-            </w:r>
-          </w:p>
-        </w:tc>
-        <w:tc>
-          <w:tcPr>
-            <w:tcW w:type="dxa" w:w="1972"/>
+              <w:t>Cuota de Préstamo</w:t>
+            </w:r>
+          </w:p>
+        </w:tc>
+        <w:tc>
+          <w:tcPr>
+            <w:tcW w:type="dxa" w:w="932"/>
             <w:vAlign w:val="center"/>
           </w:tcPr>
           <w:p>
@@ -23734,13 +24049,13 @@
                 <w:color w:val="000000"/>
                 <w:sz w:val="17"/>
               </w:rPr>
-              <w:t>-0.0725</w:t>
-            </w:r>
-          </w:p>
-        </w:tc>
-        <w:tc>
-          <w:tcPr>
-            <w:tcW w:type="dxa" w:w="1493"/>
+              <w:t>-0.1534</w:t>
+            </w:r>
+          </w:p>
+        </w:tc>
+        <w:tc>
+          <w:tcPr>
+            <w:tcW w:type="dxa" w:w="1463"/>
             <w:vAlign w:val="center"/>
           </w:tcPr>
           <w:p>
@@ -23762,7 +24077,7 @@
         </w:tc>
         <w:tc>
           <w:tcPr>
-            <w:tcW w:type="dxa" w:w="1620"/>
+            <w:tcW w:type="dxa" w:w="1323"/>
             <w:vAlign w:val="center"/>
           </w:tcPr>
           <w:p>
@@ -23778,13 +24093,13 @@
                 <w:color w:val="000000"/>
                 <w:sz w:val="17"/>
               </w:rPr>
-              <w:t>+0.0768</w:t>
-            </w:r>
-          </w:p>
-        </w:tc>
-        <w:tc>
-          <w:tcPr>
-            <w:tcW w:type="dxa" w:w="1741"/>
+              <w:t>+0.0398</w:t>
+            </w:r>
+          </w:p>
+        </w:tc>
+        <w:tc>
+          <w:tcPr>
+            <w:tcW w:type="dxa" w:w="1530"/>
             <w:vAlign w:val="center"/>
           </w:tcPr>
           <w:p>
@@ -23800,7 +24115,29 @@
                 <w:color w:val="000000"/>
                 <w:sz w:val="17"/>
               </w:rPr>
-              <w:t>-0.0345</w:t>
+              <w:t>-0.4117</w:t>
+            </w:r>
+          </w:p>
+        </w:tc>
+        <w:tc>
+          <w:tcPr>
+            <w:tcW w:type="dxa" w:w="1530"/>
+            <w:vAlign w:val="center"/>
+          </w:tcPr>
+          <w:p>
+            <w:pPr>
+              <w:spacing w:before="0" w:after="0" w:line="252" w:lineRule="auto"/>
+              <w:jc w:val="center"/>
+            </w:pPr>
+            <w:r>
+              <w:rPr>
+                <w:rFonts w:ascii="Times New Roman" w:hAnsi="Times New Roman"/>
+                <w:b w:val="0"/>
+                <w:i w:val="0"/>
+                <w:color w:val="000000"/>
+                <w:sz w:val="17"/>
+              </w:rPr>
+              <w:t>+0.0224</w:t>
             </w:r>
           </w:p>
         </w:tc>
@@ -23811,7 +24148,7 @@
         </w:trPr>
         <w:tc>
           <w:tcPr>
-            <w:tcW w:type="dxa" w:w="1972"/>
+            <w:tcW w:type="dxa" w:w="2020"/>
             <w:vAlign w:val="center"/>
           </w:tcPr>
           <w:p>
@@ -23827,13 +24164,13 @@
                 <w:color w:val="000000"/>
                 <w:sz w:val="17"/>
               </w:rPr>
-              <w:t>Cuota de Préstamo</w:t>
-            </w:r>
-          </w:p>
-        </w:tc>
-        <w:tc>
-          <w:tcPr>
-            <w:tcW w:type="dxa" w:w="1972"/>
+              <w:t>Pago de Seguros</w:t>
+            </w:r>
+          </w:p>
+        </w:tc>
+        <w:tc>
+          <w:tcPr>
+            <w:tcW w:type="dxa" w:w="932"/>
             <w:vAlign w:val="center"/>
           </w:tcPr>
           <w:p>
@@ -23849,13 +24186,13 @@
                 <w:color w:val="000000"/>
                 <w:sz w:val="17"/>
               </w:rPr>
-              <w:t>-0.0867</w:t>
-            </w:r>
-          </w:p>
-        </w:tc>
-        <w:tc>
-          <w:tcPr>
-            <w:tcW w:type="dxa" w:w="1493"/>
+              <w:t>+0.0046</w:t>
+            </w:r>
+          </w:p>
+        </w:tc>
+        <w:tc>
+          <w:tcPr>
+            <w:tcW w:type="dxa" w:w="1463"/>
             <w:vAlign w:val="center"/>
           </w:tcPr>
           <w:p>
@@ -23871,13 +24208,13 @@
                 <w:color w:val="000000"/>
                 <w:sz w:val="17"/>
               </w:rPr>
-              <w:t>+0.0768</w:t>
-            </w:r>
-          </w:p>
-        </w:tc>
-        <w:tc>
-          <w:tcPr>
-            <w:tcW w:type="dxa" w:w="1620"/>
+              <w:t>+0.0398</w:t>
+            </w:r>
+          </w:p>
+        </w:tc>
+        <w:tc>
+          <w:tcPr>
+            <w:tcW w:type="dxa" w:w="1323"/>
             <w:vAlign w:val="center"/>
           </w:tcPr>
           <w:p>
@@ -23899,7 +24236,7 @@
         </w:tc>
         <w:tc>
           <w:tcPr>
-            <w:tcW w:type="dxa" w:w="1741"/>
+            <w:tcW w:type="dxa" w:w="1530"/>
             <w:vAlign w:val="center"/>
           </w:tcPr>
           <w:p>
@@ -23915,7 +24252,29 @@
                 <w:color w:val="000000"/>
                 <w:sz w:val="17"/>
               </w:rPr>
-              <w:t>-0.4117</w:t>
+              <w:t>+0.1388</w:t>
+            </w:r>
+          </w:p>
+        </w:tc>
+        <w:tc>
+          <w:tcPr>
+            <w:tcW w:type="dxa" w:w="1530"/>
+            <w:vAlign w:val="center"/>
+          </w:tcPr>
+          <w:p>
+            <w:pPr>
+              <w:spacing w:before="0" w:after="0" w:line="252" w:lineRule="auto"/>
+              <w:jc w:val="center"/>
+            </w:pPr>
+            <w:r>
+              <w:rPr>
+                <w:rFonts w:ascii="Times New Roman" w:hAnsi="Times New Roman"/>
+                <w:b w:val="0"/>
+                <w:i w:val="0"/>
+                <w:color w:val="000000"/>
+                <w:sz w:val="17"/>
+              </w:rPr>
+              <w:t>+0.5936</w:t>
             </w:r>
           </w:p>
         </w:tc>
@@ -23926,7 +24285,7 @@
         </w:trPr>
         <w:tc>
           <w:tcPr>
-            <w:tcW w:type="dxa" w:w="1972"/>
+            <w:tcW w:type="dxa" w:w="2020"/>
             <w:vAlign w:val="center"/>
           </w:tcPr>
           <w:p>
@@ -23948,7 +24307,7 @@
         </w:tc>
         <w:tc>
           <w:tcPr>
-            <w:tcW w:type="dxa" w:w="1972"/>
+            <w:tcW w:type="dxa" w:w="932"/>
             <w:vAlign w:val="center"/>
           </w:tcPr>
           <w:p>
@@ -23964,13 +24323,13 @@
                 <w:color w:val="000000"/>
                 <w:sz w:val="17"/>
               </w:rPr>
-              <w:t>+0.0381</w:t>
-            </w:r>
-          </w:p>
-        </w:tc>
-        <w:tc>
-          <w:tcPr>
-            <w:tcW w:type="dxa" w:w="1493"/>
+              <w:t>-0.2917</w:t>
+            </w:r>
+          </w:p>
+        </w:tc>
+        <w:tc>
+          <w:tcPr>
+            <w:tcW w:type="dxa" w:w="1463"/>
             <w:vAlign w:val="center"/>
           </w:tcPr>
           <w:p>
@@ -23986,13 +24345,13 @@
                 <w:color w:val="000000"/>
                 <w:sz w:val="17"/>
               </w:rPr>
-              <w:t>-0.0345</w:t>
-            </w:r>
-          </w:p>
-        </w:tc>
-        <w:tc>
-          <w:tcPr>
-            <w:tcW w:type="dxa" w:w="1620"/>
+              <w:t>-0.4117</w:t>
+            </w:r>
+          </w:p>
+        </w:tc>
+        <w:tc>
+          <w:tcPr>
+            <w:tcW w:type="dxa" w:w="1323"/>
             <w:vAlign w:val="center"/>
           </w:tcPr>
           <w:p>
@@ -24008,13 +24367,172 @@
                 <w:color w:val="000000"/>
                 <w:sz w:val="17"/>
               </w:rPr>
-              <w:t>-0.4117</w:t>
-            </w:r>
-          </w:p>
-        </w:tc>
-        <w:tc>
-          <w:tcPr>
-            <w:tcW w:type="dxa" w:w="1741"/>
+              <w:t>+0.1388</w:t>
+            </w:r>
+          </w:p>
+        </w:tc>
+        <w:tc>
+          <w:tcPr>
+            <w:tcW w:type="dxa" w:w="1530"/>
+            <w:vAlign w:val="center"/>
+          </w:tcPr>
+          <w:p>
+            <w:pPr>
+              <w:spacing w:before="0" w:after="0" w:line="252" w:lineRule="auto"/>
+              <w:jc w:val="center"/>
+            </w:pPr>
+            <w:r>
+              <w:rPr>
+                <w:rFonts w:ascii="Times New Roman" w:hAnsi="Times New Roman"/>
+                <w:b w:val="0"/>
+                <w:i w:val="0"/>
+                <w:color w:val="000000"/>
+                <w:sz w:val="17"/>
+              </w:rPr>
+              <w:t>1.0000</w:t>
+            </w:r>
+          </w:p>
+        </w:tc>
+        <w:tc>
+          <w:tcPr>
+            <w:tcW w:type="dxa" w:w="1530"/>
+            <w:vAlign w:val="center"/>
+          </w:tcPr>
+          <w:p>
+            <w:pPr>
+              <w:spacing w:before="0" w:after="0" w:line="252" w:lineRule="auto"/>
+              <w:jc w:val="center"/>
+            </w:pPr>
+            <w:r>
+              <w:rPr>
+                <w:rFonts w:ascii="Times New Roman" w:hAnsi="Times New Roman"/>
+                <w:b w:val="0"/>
+                <w:i w:val="0"/>
+                <w:color w:val="000000"/>
+                <w:sz w:val="17"/>
+              </w:rPr>
+              <w:t>+0.2338</w:t>
+            </w:r>
+          </w:p>
+        </w:tc>
+      </w:tr>
+      <w:tr>
+        <w:trPr>
+          <w:cantSplit/>
+        </w:trPr>
+        <w:tc>
+          <w:tcPr>
+            <w:tcW w:type="dxa" w:w="2020"/>
+            <w:vAlign w:val="center"/>
+          </w:tcPr>
+          <w:p>
+            <w:pPr>
+              <w:spacing w:before="0" w:after="0" w:line="252" w:lineRule="auto"/>
+              <w:jc w:val="left"/>
+            </w:pPr>
+            <w:r>
+              <w:rPr>
+                <w:rFonts w:ascii="Times New Roman" w:hAnsi="Times New Roman"/>
+                <w:b w:val="0"/>
+                <w:i w:val="0"/>
+                <w:color w:val="000000"/>
+                <w:sz w:val="17"/>
+              </w:rPr>
+              <w:t>Sin Especificar</w:t>
+            </w:r>
+          </w:p>
+        </w:tc>
+        <w:tc>
+          <w:tcPr>
+            <w:tcW w:type="dxa" w:w="932"/>
+            <w:vAlign w:val="center"/>
+          </w:tcPr>
+          <w:p>
+            <w:pPr>
+              <w:spacing w:before="0" w:after="0" w:line="252" w:lineRule="auto"/>
+              <w:jc w:val="center"/>
+            </w:pPr>
+            <w:r>
+              <w:rPr>
+                <w:rFonts w:ascii="Times New Roman" w:hAnsi="Times New Roman"/>
+                <w:b w:val="0"/>
+                <w:i w:val="0"/>
+                <w:color w:val="000000"/>
+                <w:sz w:val="17"/>
+              </w:rPr>
+              <w:t>-0.0153</w:t>
+            </w:r>
+          </w:p>
+        </w:tc>
+        <w:tc>
+          <w:tcPr>
+            <w:tcW w:type="dxa" w:w="1463"/>
+            <w:vAlign w:val="center"/>
+          </w:tcPr>
+          <w:p>
+            <w:pPr>
+              <w:spacing w:before="0" w:after="0" w:line="252" w:lineRule="auto"/>
+              <w:jc w:val="center"/>
+            </w:pPr>
+            <w:r>
+              <w:rPr>
+                <w:rFonts w:ascii="Times New Roman" w:hAnsi="Times New Roman"/>
+                <w:b w:val="0"/>
+                <w:i w:val="0"/>
+                <w:color w:val="000000"/>
+                <w:sz w:val="17"/>
+              </w:rPr>
+              <w:t>+0.0224</w:t>
+            </w:r>
+          </w:p>
+        </w:tc>
+        <w:tc>
+          <w:tcPr>
+            <w:tcW w:type="dxa" w:w="1323"/>
+            <w:vAlign w:val="center"/>
+          </w:tcPr>
+          <w:p>
+            <w:pPr>
+              <w:spacing w:before="0" w:after="0" w:line="252" w:lineRule="auto"/>
+              <w:jc w:val="center"/>
+            </w:pPr>
+            <w:r>
+              <w:rPr>
+                <w:rFonts w:ascii="Times New Roman" w:hAnsi="Times New Roman"/>
+                <w:b w:val="0"/>
+                <w:i w:val="0"/>
+                <w:color w:val="000000"/>
+                <w:sz w:val="17"/>
+              </w:rPr>
+              <w:t>+0.5936</w:t>
+            </w:r>
+          </w:p>
+        </w:tc>
+        <w:tc>
+          <w:tcPr>
+            <w:tcW w:type="dxa" w:w="1530"/>
+            <w:vAlign w:val="center"/>
+          </w:tcPr>
+          <w:p>
+            <w:pPr>
+              <w:spacing w:before="0" w:after="0" w:line="252" w:lineRule="auto"/>
+              <w:jc w:val="center"/>
+            </w:pPr>
+            <w:r>
+              <w:rPr>
+                <w:rFonts w:ascii="Times New Roman" w:hAnsi="Times New Roman"/>
+                <w:b w:val="0"/>
+                <w:i w:val="0"/>
+                <w:color w:val="000000"/>
+                <w:sz w:val="17"/>
+              </w:rPr>
+              <w:t>+0.2338</w:t>
+            </w:r>
+          </w:p>
+        </w:tc>
+        <w:tc>
+          <w:tcPr>
+            <w:tcW w:type="dxa" w:w="1530"/>
             <w:vAlign w:val="center"/>
           </w:tcPr>
           <w:p>
@@ -31893,7 +32411,7 @@
                 <w:color w:val="000000"/>
                 <w:sz w:val="18"/>
               </w:rPr>
-              <w:t>14_eval_5fold_slope_one.py</w:t>
+              <w:t>04_calc_slope_one_matriz.py</w:t>
             </w:r>
           </w:p>
         </w:tc>
@@ -31915,7 +32433,7 @@
                 <w:color w:val="000000"/>
                 <w:sz w:val="18"/>
               </w:rPr>
-              <w:t>Validación Cruzada 5-Fold de Slope One (Punto 5)</w:t>
+              <w:t>Cálculo Canónico de Desviaciones y Soportes (Punto 5)</w:t>
             </w:r>
           </w:p>
         </w:tc>
@@ -31937,7 +32455,7 @@
                 <w:color w:val="000000"/>
                 <w:sz w:val="18"/>
               </w:rPr>
-              <w:t>Métricas de error: MAE = 0.2593 ± 0.0052 y RMSE sobre 5 pliegues.</w:t>
+              <w:t>Matriz 5 × 5 de desviaciones b(j, i) y trazabilidad Clientes #2 y #45.</w:t>
             </w:r>
           </w:p>
         </w:tc>
@@ -31964,6 +32482,290 @@
                 <w:color w:val="000000"/>
                 <w:sz w:val="18"/>
               </w:rPr>
+              <w:t>05_rec_itf_ordenes.py</w:t>
+            </w:r>
+          </w:p>
+        </w:tc>
+        <w:tc>
+          <w:tcPr>
+            <w:tcW w:type="dxa" w:w="3168"/>
+            <w:vAlign w:val="center"/>
+          </w:tcPr>
+          <w:p>
+            <w:pPr>
+              <w:spacing w:before="0" w:after="0" w:line="252" w:lineRule="auto"/>
+              <w:jc w:val="left"/>
+            </w:pPr>
+            <w:r>
+              <w:rPr>
+                <w:rFonts w:ascii="Times New Roman" w:hAnsi="Times New Roman"/>
+                <w:b w:val="0"/>
+                <w:i w:val="0"/>
+                <w:color w:val="000000"/>
+                <w:sz w:val="18"/>
+              </w:rPr>
+              <w:t>Recomendador de Órdenes y Ponderación ITF (Puntos 6 y 7)</w:t>
+            </w:r>
+          </w:p>
+        </w:tc>
+        <w:tc>
+          <w:tcPr>
+            <w:tcW w:type="dxa" w:w="2606"/>
+            <w:vAlign w:val="center"/>
+          </w:tcPr>
+          <w:p>
+            <w:pPr>
+              <w:spacing w:before="0" w:after="0" w:line="252" w:lineRule="auto"/>
+              <w:jc w:val="left"/>
+            </w:pPr>
+            <w:r>
+              <w:rPr>
+                <w:rFonts w:ascii="Times New Roman" w:hAnsi="Times New Roman"/>
+                <w:b w:val="0"/>
+                <w:i w:val="0"/>
+                <w:color w:val="000000"/>
+                <w:sz w:val="18"/>
+              </w:rPr>
+              <w:t>Factores ITF de 5 categorías, Coseno Binario 5 × 5 y Pearson 5 × 5.</w:t>
+            </w:r>
+          </w:p>
+        </w:tc>
+      </w:tr>
+      <w:tr>
+        <w:trPr>
+          <w:cantSplit/>
+        </w:trPr>
+        <w:tc>
+          <w:tcPr>
+            <w:tcW w:type="dxa" w:w="3024"/>
+            <w:vAlign w:val="center"/>
+          </w:tcPr>
+          <w:p>
+            <w:pPr>
+              <w:spacing w:before="0" w:after="0" w:line="252" w:lineRule="auto"/>
+              <w:jc w:val="left"/>
+            </w:pPr>
+            <w:r>
+              <w:rPr>
+                <w:rFonts w:ascii="Times New Roman" w:hAnsi="Times New Roman"/>
+                <w:b w:val="0"/>
+                <w:i w:val="0"/>
+                <w:color w:val="000000"/>
+                <w:sz w:val="18"/>
+              </w:rPr>
+              <w:t>06_calc_pearson_diferenciado.py</w:t>
+            </w:r>
+          </w:p>
+        </w:tc>
+        <w:tc>
+          <w:tcPr>
+            <w:tcW w:type="dxa" w:w="3168"/>
+            <w:vAlign w:val="center"/>
+          </w:tcPr>
+          <w:p>
+            <w:pPr>
+              <w:spacing w:before="0" w:after="0" w:line="252" w:lineRule="auto"/>
+              <w:jc w:val="left"/>
+            </w:pPr>
+            <w:r>
+              <w:rPr>
+                <w:rFonts w:ascii="Times New Roman" w:hAnsi="Times New Roman"/>
+                <w:b w:val="0"/>
+                <w:i w:val="0"/>
+                <w:color w:val="000000"/>
+                <w:sz w:val="18"/>
+              </w:rPr>
+              <w:t>Correlación Temporal Diferenciada (Punto 6)</w:t>
+            </w:r>
+          </w:p>
+        </w:tc>
+        <w:tc>
+          <w:tcPr>
+            <w:tcW w:type="dxa" w:w="2606"/>
+            <w:vAlign w:val="center"/>
+          </w:tcPr>
+          <w:p>
+            <w:pPr>
+              <w:spacing w:before="0" w:after="0" w:line="252" w:lineRule="auto"/>
+              <w:jc w:val="left"/>
+            </w:pPr>
+            <w:r>
+              <w:rPr>
+                <w:rFonts w:ascii="Times New Roman" w:hAnsi="Times New Roman"/>
+                <w:b w:val="0"/>
+                <w:i w:val="0"/>
+                <w:color w:val="000000"/>
+                <w:sz w:val="18"/>
+              </w:rPr>
+              <w:t>Matriz de Pearson sobre flujos mensuales estacionarios (Δx_t, 71 meses).</w:t>
+            </w:r>
+          </w:p>
+        </w:tc>
+      </w:tr>
+      <w:tr>
+        <w:trPr>
+          <w:cantSplit/>
+        </w:trPr>
+        <w:tc>
+          <w:tcPr>
+            <w:tcW w:type="dxa" w:w="3024"/>
+            <w:vAlign w:val="center"/>
+          </w:tcPr>
+          <w:p>
+            <w:pPr>
+              <w:spacing w:before="0" w:after="0" w:line="252" w:lineRule="auto"/>
+              <w:jc w:val="left"/>
+            </w:pPr>
+            <w:r>
+              <w:rPr>
+                <w:rFonts w:ascii="Times New Roman" w:hAnsi="Times New Roman"/>
+                <w:b w:val="0"/>
+                <w:i w:val="0"/>
+                <w:color w:val="000000"/>
+                <w:sz w:val="18"/>
+              </w:rPr>
+              <w:t>07_calc_prestamos_coseno_utilidad.py</w:t>
+            </w:r>
+          </w:p>
+        </w:tc>
+        <w:tc>
+          <w:tcPr>
+            <w:tcW w:type="dxa" w:w="3168"/>
+            <w:vAlign w:val="center"/>
+          </w:tcPr>
+          <w:p>
+            <w:pPr>
+              <w:spacing w:before="0" w:after="0" w:line="252" w:lineRule="auto"/>
+              <w:jc w:val="left"/>
+            </w:pPr>
+            <w:r>
+              <w:rPr>
+                <w:rFonts w:ascii="Times New Roman" w:hAnsi="Times New Roman"/>
+                <w:b w:val="0"/>
+                <w:i w:val="0"/>
+                <w:color w:val="000000"/>
+                <w:sz w:val="18"/>
+              </w:rPr>
+              <w:t>Modelos de Cartera, Coseno Z-Score y Utilidad (Puntos 6 y 8)</w:t>
+            </w:r>
+          </w:p>
+        </w:tc>
+        <w:tc>
+          <w:tcPr>
+            <w:tcW w:type="dxa" w:w="2606"/>
+            <w:vAlign w:val="center"/>
+          </w:tcPr>
+          <w:p>
+            <w:pPr>
+              <w:spacing w:before="0" w:after="0" w:line="252" w:lineRule="auto"/>
+              <w:jc w:val="left"/>
+            </w:pPr>
+            <w:r>
+              <w:rPr>
+                <w:rFonts w:ascii="Times New Roman" w:hAnsi="Times New Roman"/>
+                <w:b w:val="0"/>
+                <w:i w:val="0"/>
+                <w:color w:val="000000"/>
+                <w:sz w:val="18"/>
+              </w:rPr>
+              <w:t>Coseno de plazos, análisis de mora por tramo ≤30% y tests Chi²/Fisher.</w:t>
+            </w:r>
+          </w:p>
+        </w:tc>
+      </w:tr>
+      <w:tr>
+        <w:trPr>
+          <w:cantSplit/>
+        </w:trPr>
+        <w:tc>
+          <w:tcPr>
+            <w:tcW w:type="dxa" w:w="3024"/>
+            <w:vAlign w:val="center"/>
+          </w:tcPr>
+          <w:p>
+            <w:pPr>
+              <w:spacing w:before="0" w:after="0" w:line="252" w:lineRule="auto"/>
+              <w:jc w:val="left"/>
+            </w:pPr>
+            <w:r>
+              <w:rPr>
+                <w:rFonts w:ascii="Times New Roman" w:hAnsi="Times New Roman"/>
+                <w:b w:val="0"/>
+                <w:i w:val="0"/>
+                <w:color w:val="000000"/>
+                <w:sz w:val="18"/>
+              </w:rPr>
+              <w:t>14_eval_5fold_slope_one.py</w:t>
+            </w:r>
+          </w:p>
+        </w:tc>
+        <w:tc>
+          <w:tcPr>
+            <w:tcW w:type="dxa" w:w="3168"/>
+            <w:vAlign w:val="center"/>
+          </w:tcPr>
+          <w:p>
+            <w:pPr>
+              <w:spacing w:before="0" w:after="0" w:line="252" w:lineRule="auto"/>
+              <w:jc w:val="left"/>
+            </w:pPr>
+            <w:r>
+              <w:rPr>
+                <w:rFonts w:ascii="Times New Roman" w:hAnsi="Times New Roman"/>
+                <w:b w:val="0"/>
+                <w:i w:val="0"/>
+                <w:color w:val="000000"/>
+                <w:sz w:val="18"/>
+              </w:rPr>
+              <w:t>Validación Cruzada 5-Fold de Slope One (Punto 5)</w:t>
+            </w:r>
+          </w:p>
+        </w:tc>
+        <w:tc>
+          <w:tcPr>
+            <w:tcW w:type="dxa" w:w="2606"/>
+            <w:vAlign w:val="center"/>
+          </w:tcPr>
+          <w:p>
+            <w:pPr>
+              <w:spacing w:before="0" w:after="0" w:line="252" w:lineRule="auto"/>
+              <w:jc w:val="left"/>
+            </w:pPr>
+            <w:r>
+              <w:rPr>
+                <w:rFonts w:ascii="Times New Roman" w:hAnsi="Times New Roman"/>
+                <w:b w:val="0"/>
+                <w:i w:val="0"/>
+                <w:color w:val="000000"/>
+                <w:sz w:val="18"/>
+              </w:rPr>
+              <w:t>Métricas de error: MAE = 0.2593 ± 0.0052 y RMSE sobre 5 pliegues.</w:t>
+            </w:r>
+          </w:p>
+        </w:tc>
+      </w:tr>
+      <w:tr>
+        <w:trPr>
+          <w:cantSplit/>
+        </w:trPr>
+        <w:tc>
+          <w:tcPr>
+            <w:tcW w:type="dxa" w:w="3024"/>
+            <w:vAlign w:val="center"/>
+          </w:tcPr>
+          <w:p>
+            <w:pPr>
+              <w:spacing w:before="0" w:after="0" w:line="252" w:lineRule="auto"/>
+              <w:jc w:val="left"/>
+            </w:pPr>
+            <w:r>
+              <w:rPr>
+                <w:rFonts w:ascii="Times New Roman" w:hAnsi="Times New Roman"/>
+                <w:b w:val="0"/>
+                <w:i w:val="0"/>
+                <w:color w:val="000000"/>
+                <w:sz w:val="18"/>
+              </w:rPr>
               <w:t>15_eval_topn_ranking.py</w:t>
             </w:r>
           </w:p>
@@ -32008,7 +32810,7 @@
                 <w:color w:val="000000"/>
                 <w:sz w:val="18"/>
               </w:rPr>
-              <w:t>Curvas Hit-Rate@k (HR@1 = 91.79%) y MRR = 0.9567.</w:t>
+              <w:t>Curvas Hit-Rate@k (HR@1 = 91.79%) y MRR = 0.9469.</w:t>
             </w:r>
           </w:p>
         </w:tc>

</xml_diff>